<commit_message>
MOM: fix non-clickable NDPS Act citation URL
Converted MOM9's NDPS Act 1985 Verified-Sources citation link from
plain text containing a URL into a real clickable OOXML hyperlink.

Co-Authored-By: Claude Sonnet 5 <noreply@anthropic.com>
Claude-Session: https://claude.ai/code/session_016VFLsECWt4VArpBiaqgrgF
</commit_message>
<xml_diff>
--- a/policies/build/chapters_v2/MOM/Document/MOM9/SOP_Narcotic_Psychotropic_Handling.docx
+++ b/policies/build/chapters_v2/MOM/Document/MOM9/SOP_Narcotic_Psychotropic_Handling.docx
@@ -496,12 +496,15 @@
       <w:pPr>
         <w:pStyle w:val="ListParagraph"/>
       </w:pPr>
-      <w:r>
-        <w:rPr>
-          <w:i/>
-        </w:rPr>
-        <w:t>Government of India. (1985). The Narcotic Drugs and Psychotropic Substances Act, 1985 (Act No. 61 of 1985). https://www.indiacode.nic.in/bitstream/123456789/1791/5/a1985-61.pdf</w:t>
-      </w:r>
+      <w:hyperlink r:id="rId9">
+        <w:r>
+          <w:rPr>
+            <w:rStyle w:val="Hyperlink"/>
+            <w:i/>
+          </w:rPr>
+          <w:t>Government of India. (1985). The Narcotic Drugs and Psychotropic Substances Act, 1985 (Act No. 61 of 1985). https://www.indiacode.nic.in/bitstream/123456789/1791/5/a1985-61.pdf</w:t>
+        </w:r>
+      </w:hyperlink>
     </w:p>
     <w:p>
       <w:pPr>

</xml_diff>